<commit_message>
fixed uv, liturgy dismissals, echo 7
</commit_message>
<xml_diff>
--- a/flow/20230905_templates/03-Літургія-НЮ.docx
+++ b/flow/20230905_templates/03-Літургія-НЮ.docx
@@ -1354,7 +1354,7 @@
           <w:rFonts w:ascii="Times New Roman" w:hAnsi="Times New Roman"/>
           <w:sz w:val="24"/>
         </w:rPr>
-        <w:t xml:space="preserve"> Христос, істинний Бог наш, молитвами пречистої своєї Матері, святого отця нашого Миколая, архиєпископа, мирлікійського чудотворця, святих, славних і всехвальних апостолів, святого отця нашого Йоана Золотоустого, архиєпископа Константинограда, святого, </w:t>
+        <w:t xml:space="preserve"> Христос, істинний Бог наш, молитвами пречистої своєї Матері, силою чесного і животворного Хреста, святих, славних і всехвальних апостолів, святого отця нашого Йоана Золотоустого, архиєпископа Константинограда, святого, </w:t>
       </w:r>
       <w:r>
         <w:rPr>
@@ -2950,7 +2950,7 @@
           <w:rFonts w:ascii="Times New Roman" w:hAnsi="Times New Roman"/>
           <w:sz w:val="24"/>
         </w:rPr>
-        <w:t xml:space="preserve"> Христос, істинний Бог наш, молитвами пречистої своєї Матері, святого отця нашого Миколая, архиєпископа, мирлікійського чудотворця, святих, славних і всехвальних апостолів, святого отця нашого Йоана Золотоустого, архиєпископа Константинограда, святого, </w:t>
+        <w:t xml:space="preserve"> Христос, істинний Бог наш, молитвами пречистої своєї Матері, силою чесного і животворного Хреста, заступництвом чесних небесних сил безтілесних, чесного, славного пророка, предтечі і христителя Йоана, святих, славних і всехвальних апостолів, святого отця нашого Миколая, архиєпископа мирлікійського, чудотворця, святих славних і переможних мучеників, преподобних і богоносних отців наших, святого отця нашого Йоана Золотоустого, архиєпископа Константинограда, святих і праведних богоотців Йоакима й Анни, святого, </w:t>
       </w:r>
       <w:r>
         <w:rPr>
@@ -4477,7 +4477,7 @@
           <w:rFonts w:ascii="Times New Roman" w:hAnsi="Times New Roman"/>
           <w:sz w:val="24"/>
         </w:rPr>
-        <w:t xml:space="preserve"> Христос, істинний Бог наш, молитвами пречистої своєї Матері, святого отця нашого Миколая, архиєпископа, мирлікійського чудотворця, святих, славних і всехвальних апостолів, святого отця нашого Йоана Золотоустого, архиєпископа Константинограда, святого, </w:t>
+        <w:t xml:space="preserve"> Христос, що воскрес із мертвих, істинний Бог наш, молитвами пречистої своєї Матері, святих, славних і всехвальних апостолів, святого отця нашого Йоана Золотоустого, архиєпископа Константинограда, святого, </w:t>
       </w:r>
       <w:r>
         <w:rPr>
@@ -5893,7 +5893,7 @@
           <w:rFonts w:ascii="Times New Roman" w:hAnsi="Times New Roman"/>
           <w:sz w:val="24"/>
         </w:rPr>
-        <w:t xml:space="preserve"> Христос, істинний Бог наш, молитвами пречистої своєї Матері, святого отця нашого Миколая, архиєпископа, мирлікійського чудотворця, святих, славних і всехвальних апостолів, святого отця нашого Йоана Золотоустого, архиєпископа Константинограда, святого, </w:t>
+        <w:t xml:space="preserve"> Христос, істинний Бог наш, молитвами пречистої своєї Матері, заступництвом чесних небесних сил безтілесних, святих, славних і всехвальних апостолів, святого отця нашого Йоана Золотоустого, архиєпископа Константинограда, святого, </w:t>
       </w:r>
       <w:r>
         <w:rPr>
@@ -7323,7 +7323,7 @@
           <w:rFonts w:ascii="Times New Roman" w:hAnsi="Times New Roman"/>
           <w:sz w:val="24"/>
         </w:rPr>
-        <w:t xml:space="preserve"> Христос, істинний Бог наш, молитвами пречистої своєї Матері, святого отця нашого Миколая, архиєпископа, мирлікійського чудотворця, святих, славних і всехвальних апостолів, святого отця нашого Йоана Золотоустого, архиєпископа Константинограда, святого, </w:t>
+        <w:t xml:space="preserve"> Христос, істинний Бог наш, молитвами пречистої своєї Матері, чесного і славного пророка, предтечі і христителя Йоана, святих, славних і всехвальних апостолів, святого отця нашого Йоана Золотоустого, архиєпископа Константинограда, святого, </w:t>
       </w:r>
       <w:r>
         <w:rPr>
@@ -8705,7 +8705,7 @@
           <w:rFonts w:ascii="Times New Roman" w:hAnsi="Times New Roman"/>
           <w:sz w:val="24"/>
         </w:rPr>
-        <w:t xml:space="preserve"> Христос, істинний Бог наш, молитвами пречистої своєї Матері, святого отця нашого Миколая, архиєпископа, мирлікійського чудотворця, святих, славних і всехвальних апостолів, святого отця нашого Йоана Золотоустого, архиєпископа Константинограда, святого, </w:t>
+        <w:t xml:space="preserve"> Христос, істинний Бог наш, молитвами пречистої своєї Матері, силою чесного і животворного Хреста, святих, славних і всехвальних апостолів, святого отця нашого Йоана Золотоустого, архиєпископа Константинограда, святого, </w:t>
       </w:r>
       <w:r>
         <w:rPr>
@@ -11656,7 +11656,7 @@
           <w:rFonts w:ascii="Times New Roman" w:hAnsi="Times New Roman"/>
           <w:sz w:val="24"/>
         </w:rPr>
-        <w:t xml:space="preserve"> Христос, істинний Бог наш, молитвами пречистої своєї Матері, святого отця нашого Миколая, архиєпископа, мирлікійського чудотворця, святих, славних і всехвальних апостолів, святого отця нашого Йоана Золотоустого, архиєпископа Константинограда, святого, </w:t>
+        <w:t xml:space="preserve"> Христос, істинний Бог наш, молитвами пречистої своєї Матері, силою чесного і животворного Хреста, святих, славних і всехвальних апостолів, святого отця нашого Йоана Золотоустого, архиєпископа Константинограда, святого, </w:t>
       </w:r>
       <w:r>
         <w:rPr>
@@ -13258,7 +13258,7 @@
           <w:rFonts w:ascii="Times New Roman" w:hAnsi="Times New Roman"/>
           <w:sz w:val="24"/>
         </w:rPr>
-        <w:t xml:space="preserve"> Христос, істинний Бог наш, молитвами пречистої своєї Матері, святого отця нашого Миколая, архиєпископа, мирлікійського чудотворця, святих, славних і всехвальних апостолів, святого отця нашого Йоана Золотоустого, архиєпископа Константинограда, святого, </w:t>
+        <w:t xml:space="preserve"> Христос, істинний Бог наш, молитвами пречистої своєї Матері, силою чесного і животворного Хреста, заступництвом чесних небесних сил безтілесних, чесного, славного пророка, предтечі і христителя Йоана, святих, славних і всехвальних апостолів, святого отця нашого Миколая, архиєпископа мирлікійського, чудотворця, святих славних і переможних мучеників, преподобних і богоносних отців наших, святого отця нашого Йоана Золотоустого, архиєпископа Константинограда, святих і праведних богоотців Йоакима й Анни, святого, </w:t>
       </w:r>
       <w:r>
         <w:rPr>
@@ -14760,7 +14760,7 @@
           <w:rFonts w:ascii="Times New Roman" w:hAnsi="Times New Roman"/>
           <w:sz w:val="24"/>
         </w:rPr>
-        <w:t xml:space="preserve"> Христос, істинний Бог наш, молитвами пречистої своєї Матері, святого отця нашого Миколая, архиєпископа, мирлікійського чудотворця, святих, славних і всехвальних апостолів, святого отця нашого Йоана Золотоустого, архиєпископа Константинограда, святого, </w:t>
+        <w:t xml:space="preserve"> Христос, що воскрес із мертвих, істинний Бог наш, молитвами пречистої своєї Матері, святих, славних і всехвальних апостолів, святого отця нашого Йоана Золотоустого, архиєпископа Константинограда, святого, </w:t>
       </w:r>
       <w:r>
         <w:rPr>
@@ -16212,7 +16212,7 @@
           <w:rFonts w:ascii="Times New Roman" w:hAnsi="Times New Roman"/>
           <w:sz w:val="24"/>
         </w:rPr>
-        <w:t xml:space="preserve"> Христос, істинний Бог наш, молитвами пречистої своєї Матері, святого отця нашого Миколая, архиєпископа, мирлікійського чудотворця, святих, славних і всехвальних апостолів, святого отця нашого Йоана Золотоустого, архиєпископа Константинограда, святого, </w:t>
+        <w:t xml:space="preserve"> Христос, істинний Бог наш, молитвами пречистої своєї Матері, заступництвом чесних небесних сил безтілесних, святих, славних і всехвальних апостолів, святого отця нашого Йоана Золотоустого, архиєпископа Константинограда, святого, </w:t>
       </w:r>
       <w:r>
         <w:rPr>
@@ -17730,7 +17730,7 @@
           <w:rFonts w:ascii="Times New Roman" w:hAnsi="Times New Roman"/>
           <w:sz w:val="24"/>
         </w:rPr>
-        <w:t xml:space="preserve"> Христос, істинний Бог наш, молитвами пречистої своєї Матері, святого отця нашого Миколая, архиєпископа, мирлікійського чудотворця, святих, славних і всехвальних апостолів, святого отця нашого Йоана Золотоустого, архиєпископа Константинограда, святого, </w:t>
+        <w:t xml:space="preserve"> Христос, істинний Бог наш, молитвами пречистої своєї Матері, чесного і славного пророка, предтечі і христителя Йоана, святих, славних і всехвальних апостолів, святого отця нашого Йоана Золотоустого, архиєпископа Константинограда, святого, </w:t>
       </w:r>
       <w:r>
         <w:rPr>
@@ -20858,7 +20858,7 @@
           <w:rFonts w:ascii="Times New Roman" w:hAnsi="Times New Roman"/>
           <w:sz w:val="24"/>
         </w:rPr>
-        <w:t xml:space="preserve"> Христос, істинний Бог наш, молитвами пречистої своєї Матері, святого отця нашого Миколая, архиєпископа, мирлікійського чудотворця, святих, славних і всехвальних апостолів, святого отця нашого Йоана Золотоустого, архиєпископа Константинограда, святого, </w:t>
+        <w:t xml:space="preserve"> Христос, істинний Бог наш, молитвами пречистої своєї Матері, силою чесного і животворного Хреста, заступництвом чесних небесних сил безтілесних, чесного, славного пророка, предтечі і христителя Йоана, святих, славних і всехвальних апостолів, святого отця нашого Миколая, архиєпископа мирлікійського, чудотворця, святих славних і переможних мучеників, преподобних і богоносних отців наших, святого отця нашого Йоана Золотоустого, архиєпископа Константинограда, святих і праведних богоотців Йоакима й Анни, святого, </w:t>
       </w:r>
       <w:r>
         <w:rPr>
@@ -22342,7 +22342,7 @@
           <w:rFonts w:ascii="Times New Roman" w:hAnsi="Times New Roman"/>
           <w:sz w:val="24"/>
         </w:rPr>
-        <w:t xml:space="preserve"> Христос, істинний Бог наш, молитвами пречистої своєї Матері, святого отця нашого Миколая, архиєпископа, мирлікійського чудотворця, святих, славних і всехвальних апостолів, святого отця нашого Йоана Золотоустого, архиєпископа Константинограда, святого, </w:t>
+        <w:t xml:space="preserve"> Христос, що воскрес із мертвих, істинний Бог наш, молитвами пречистої своєї Матері, святих, славних і всехвальних апостолів, святого отця нашого Йоана Золотоустого, архиєпископа Константинограда, святого, </w:t>
       </w:r>
       <w:r>
         <w:rPr>
@@ -24009,7 +24009,7 @@
           <w:rFonts w:ascii="Times New Roman" w:hAnsi="Times New Roman"/>
           <w:sz w:val="24"/>
         </w:rPr>
-        <w:t xml:space="preserve"> Христос, істинний Бог наш, молитвами пречистої своєї Матері, святого отця нашого Миколая, архиєпископа, мирлікійського чудотворця, святих, славних і всехвальних апостолів, святого отця нашого Йоана Золотоустого, архиєпископа Константинограда, святого, </w:t>
+        <w:t xml:space="preserve"> Христос, істинний Бог наш, молитвами пречистої своєї Матері, силою чесного і животворного Хреста, заступництвом чесних небесних сил безтілесних, чесного, славного пророка, предтечі і христителя Йоана, святих, славних і всехвальних апостолів, святого отця нашого Миколая, архиєпископа мирлікійського, чудотворця, святих славних і переможних мучеників, преподобних і богоносних отців наших, святого отця нашого Йоана Золотоустого, архиєпископа Константинограда, святих і праведних богоотців Йоакима й Анни, святого, </w:t>
       </w:r>
       <w:r>
         <w:rPr>
@@ -25557,7 +25557,7 @@
           <w:rFonts w:ascii="Times New Roman" w:hAnsi="Times New Roman"/>
           <w:sz w:val="24"/>
         </w:rPr>
-        <w:t xml:space="preserve"> Христос, істинний Бог наш, молитвами пречистої своєї Матері, святого отця нашого Миколая, архиєпископа, мирлікійського чудотворця, святих, славних і всехвальних апостолів, святого отця нашого Василія Великого, архиєпископа Кесарії Кападокійської, святого, </w:t>
+        <w:t xml:space="preserve"> Христос, що воскрес із мертвих, істинний Бог наш, молитвами пречистої своєї Матері, святих, славних і всехвальних апостолів, святого отця нашого Василія Великого, архиєпископа Кесарії Кападокійської, святого, </w:t>
       </w:r>
       <w:r>
         <w:rPr>
@@ -27183,7 +27183,7 @@
           <w:rFonts w:ascii="Times New Roman" w:hAnsi="Times New Roman"/>
           <w:sz w:val="24"/>
         </w:rPr>
-        <w:t xml:space="preserve"> Христос, істинний Бог наш, молитвами пречистої своєї Матері, святого отця нашого Миколая, архиєпископа, мирлікійського чудотворця, святих, славних і всехвальних апостолів, святого отця нашого Йоана Золотоустого, архиєпископа Константинограда, святого, </w:t>
+        <w:t xml:space="preserve"> Христос, істинний Бог наш, молитвами пречистої своєї Матері, силою чесного і животворного Хреста, заступництвом чесних небесних сил безтілесних, чесного, славного пророка, предтечі і христителя Йоана, святих, славних і всехвальних апостолів, святого отця нашого Миколая, архиєпископа мирлікійського, чудотворця, святих славних і переможних мучеників, преподобних і богоносних отців наших, святого отця нашого Йоана Золотоустого, архиєпископа Константинограда, святих і праведних богоотців Йоакима й Анни, святого, </w:t>
       </w:r>
       <w:r>
         <w:rPr>
@@ -28666,7 +28666,7 @@
           <w:rFonts w:ascii="Times New Roman" w:hAnsi="Times New Roman"/>
           <w:sz w:val="24"/>
         </w:rPr>
-        <w:t xml:space="preserve"> Христос, істинний Бог наш, молитвами пречистої своєї Матері, святого отця нашого Миколая, архиєпископа, мирлікійського чудотворця, святих, славних і всехвальних апостолів, святого отця нашого Василія Великого, архиєпископа Кесарії Кападокійської, святого, </w:t>
+        <w:t xml:space="preserve"> Христос, що воскрес із мертвих, істинний Бог наш, молитвами пречистої своєї Матері, святих, славних і всехвальних апостолів, святого отця нашого Василія Великого, архиєпископа Кесарії Кападокійської, святого, </w:t>
       </w:r>
       <w:r>
         <w:rPr>

</xml_diff>